<commit_message>
documentation: Update README.md and add Windows script
</commit_message>
<xml_diff>
--- a/Backend System Documentation.docx
+++ b/Backend System Documentation.docx
@@ -1093,9 +1093,266 @@
         </w:r>
       </w:hyperlink>
       <w:r>
-        <w:t> still points to http://localhost:5000</w:t>
-      </w:r>
-    </w:p>
+        <w:t> still points to </w:t>
+      </w:r>
+      <w:hyperlink r:id="rId17" w:history="1">
+        <w:r>
+          <w:rPr>
+            <w:rStyle w:val="Hyperlink"/>
+          </w:rPr>
+          <w:t>http://localhost:5000</w:t>
+        </w:r>
+      </w:hyperlink>
+    </w:p>
+    <w:p/>
+    <w:p/>
+    <w:p>
+      <w:r>
+        <w:t>The backend is structured well and uses good libraries, but it has several important security and reliability issues:</w:t>
+      </w:r>
+    </w:p>
+    <w:p>
+      <w:pPr>
+        <w:numPr>
+          <w:ilvl w:val="0"/>
+          <w:numId w:val="5"/>
+        </w:numPr>
+      </w:pPr>
+      <w:r>
+        <w:t>SQL injection risk</w:t>
+      </w:r>
+    </w:p>
+    <w:p>
+      <w:pPr>
+        <w:numPr>
+          <w:ilvl w:val="0"/>
+          <w:numId w:val="5"/>
+        </w:numPr>
+      </w:pPr>
+      <w:r>
+        <w:t>connection release problems</w:t>
+      </w:r>
+    </w:p>
+    <w:p>
+      <w:pPr>
+        <w:numPr>
+          <w:ilvl w:val="0"/>
+          <w:numId w:val="5"/>
+        </w:numPr>
+      </w:pPr>
+      <w:r>
+        <w:t>missing auth/authorization checks</w:t>
+      </w:r>
+    </w:p>
+    <w:p>
+      <w:pPr>
+        <w:numPr>
+          <w:ilvl w:val="0"/>
+          <w:numId w:val="5"/>
+        </w:numPr>
+      </w:pPr>
+      <w:proofErr w:type="spellStart"/>
+      <w:r>
+        <w:t>GraphQL</w:t>
+      </w:r>
+      <w:proofErr w:type="spellEnd"/>
+      <w:r>
+        <w:t xml:space="preserve"> type mismatches</w:t>
+      </w:r>
+    </w:p>
+    <w:p>
+      <w:r>
+        <w:t>If you want, I can also review the frontend JavaScript files next.</w:t>
+      </w:r>
+    </w:p>
+    <w:p/>
+    <w:p/>
+    <w:p>
+      <w:r>
+        <w:lastRenderedPageBreak/>
+        <w:t>Risk Fixing and Backend Hardening</w:t>
+      </w:r>
+      <w:r>
+        <w:t>, Dependencies installation</w:t>
+      </w:r>
+      <w:r>
+        <w:t>,</w:t>
+      </w:r>
+      <w:r>
+        <w:rPr>
+          <w:rFonts w:ascii="Segoe UI" w:hAnsi="Segoe UI" w:cs="Segoe UI"/>
+          <w:color w:val="BFBFBF"/>
+          <w:sz w:val="20"/>
+          <w:szCs w:val="20"/>
+          <w:shd w:val="clear" w:color="auto" w:fill="191A1B"/>
+        </w:rPr>
+        <w:t xml:space="preserve"> </w:t>
+      </w:r>
+      <w:r>
+        <w:t>Updated backend startup scripts</w:t>
+      </w:r>
+    </w:p>
+    <w:p/>
+    <w:p>
+      <w:pPr>
+        <w:numPr>
+          <w:ilvl w:val="0"/>
+          <w:numId w:val="6"/>
+        </w:numPr>
+      </w:pPr>
+      <w:proofErr w:type="spellStart"/>
+      <w:r>
+        <w:t>npm</w:t>
+      </w:r>
+      <w:proofErr w:type="spellEnd"/>
+      <w:r>
+        <w:t xml:space="preserve"> run start-win</w:t>
+      </w:r>
+    </w:p>
+    <w:p>
+      <w:pPr>
+        <w:numPr>
+          <w:ilvl w:val="0"/>
+          <w:numId w:val="6"/>
+        </w:numPr>
+      </w:pPr>
+      <w:proofErr w:type="spellStart"/>
+      <w:r>
+        <w:t>npm</w:t>
+      </w:r>
+      <w:proofErr w:type="spellEnd"/>
+      <w:r>
+        <w:t xml:space="preserve"> run dev-win</w:t>
+      </w:r>
+    </w:p>
+    <w:p/>
+    <w:p>
+      <w:r>
+        <w:t xml:space="preserve">SSMS Backend API Server Running                             </w:t>
+      </w:r>
+      <w:r>
+        <w:rPr>
+          <w:rFonts w:ascii="Arial" w:hAnsi="Arial" w:cs="Arial"/>
+        </w:rPr>
+        <w:t>║</w:t>
+      </w:r>
+    </w:p>
+    <w:p>
+      <w:r>
+        <w:rPr>
+          <w:rFonts w:ascii="Arial" w:hAnsi="Arial" w:cs="Arial"/>
+        </w:rPr>
+        <w:t>║</w:t>
+      </w:r>
+      <w:r>
+        <w:t xml:space="preserve">   </w:t>
+      </w:r>
+      <w:r>
+        <w:rPr>
+          <w:rFonts w:ascii="Aptos" w:hAnsi="Aptos" w:cs="Aptos"/>
+        </w:rPr>
+        <w:t>───────────────────────</w:t>
+      </w:r>
+      <w:r>
+        <w:rPr>
+          <w:rFonts w:ascii="Aptos" w:hAnsi="Aptos" w:cs="Aptos"/>
+        </w:rPr>
+        <w:t xml:space="preserve"> </w:t>
+      </w:r>
+      <w:r>
+        <w:rPr>
+          <w:rFonts w:ascii="Aptos" w:hAnsi="Aptos" w:cs="Aptos"/>
+        </w:rPr>
+        <w:t>───────────────</w:t>
+      </w:r>
+      <w:r>
+        <w:t xml:space="preserve"> </w:t>
+      </w:r>
+      <w:r>
+        <w:rPr>
+          <w:rFonts w:ascii="Arial" w:hAnsi="Arial" w:cs="Arial"/>
+        </w:rPr>
+        <w:t>║</w:t>
+      </w:r>
+    </w:p>
+    <w:p>
+      <w:r>
+        <w:rPr>
+          <w:rFonts w:ascii="Arial" w:hAnsi="Arial" w:cs="Arial"/>
+        </w:rPr>
+        <w:t>║</w:t>
+      </w:r>
+      <w:r>
+        <w:t xml:space="preserve">   REST API:  http://localhost:5000/api                     </w:t>
+      </w:r>
+      <w:r>
+        <w:rPr>
+          <w:rFonts w:ascii="Arial" w:hAnsi="Arial" w:cs="Arial"/>
+        </w:rPr>
+        <w:t>║</w:t>
+      </w:r>
+    </w:p>
+    <w:p>
+      <w:r>
+        <w:rPr>
+          <w:rFonts w:ascii="Arial" w:hAnsi="Arial" w:cs="Arial"/>
+        </w:rPr>
+        <w:t>║</w:t>
+      </w:r>
+      <w:r>
+        <w:t xml:space="preserve">   </w:t>
+      </w:r>
+      <w:proofErr w:type="spellStart"/>
+      <w:r>
+        <w:t>GraphQL</w:t>
+      </w:r>
+      <w:proofErr w:type="spellEnd"/>
+      <w:r>
+        <w:t xml:space="preserve">:   http://localhost:5000/graphql          </w:t>
+      </w:r>
+      <w:r>
+        <w:rPr>
+          <w:rFonts w:ascii="Arial" w:hAnsi="Arial" w:cs="Arial"/>
+        </w:rPr>
+        <w:t>║</w:t>
+      </w:r>
+    </w:p>
+    <w:p>
+      <w:r>
+        <w:rPr>
+          <w:rFonts w:ascii="Arial" w:hAnsi="Arial" w:cs="Arial"/>
+        </w:rPr>
+        <w:t>║</w:t>
+      </w:r>
+      <w:r>
+        <w:t xml:space="preserve">   Health:    http://localhost:5000/health               </w:t>
+      </w:r>
+      <w:r>
+        <w:t xml:space="preserve"> </w:t>
+      </w:r>
+      <w:r>
+        <w:t xml:space="preserve"> </w:t>
+      </w:r>
+      <w:r>
+        <w:rPr>
+          <w:rFonts w:ascii="Arial" w:hAnsi="Arial" w:cs="Arial"/>
+        </w:rPr>
+        <w:t>║</w:t>
+      </w:r>
+    </w:p>
+    <w:p>
+      <w:r>
+        <w:rPr>
+          <w:rFonts w:ascii="Arial" w:hAnsi="Arial" w:cs="Arial"/>
+        </w:rPr>
+        <w:t>║</w:t>
+      </w:r>
+      <w:r>
+        <w:t xml:space="preserve">   Environment: development     </w:t>
+      </w:r>
+    </w:p>
+    <w:p/>
+    <w:p/>
     <w:p/>
     <w:p/>
     <w:sectPr>
@@ -1111,6 +1368,155 @@
 <file path=word/numbering.xml><?xml version="1.0" encoding="utf-8"?>
 <w:numbering xmlns:wpc="http://schemas.microsoft.com/office/word/2010/wordprocessingCanvas" xmlns:cx="http://schemas.microsoft.com/office/drawing/2014/chartex" xmlns:cx1="http://schemas.microsoft.com/office/drawing/2015/9/8/chartex" xmlns:cx2="http://schemas.microsoft.com/office/drawing/2015/10/21/chartex" xmlns:cx3="http://schemas.microsoft.com/office/drawing/2016/5/9/chartex" xmlns:cx4="http://schemas.microsoft.com/office/drawing/2016/5/10/chartex" xmlns:cx5="http://schemas.microsoft.com/office/drawing/2016/5/11/chartex" xmlns:cx6="http://schemas.microsoft.com/office/drawing/2016/5/12/chartex" xmlns:cx7="http://schemas.microsoft.com/office/drawing/2016/5/13/chartex" xmlns:cx8="http://schemas.microsoft.com/office/drawing/2016/5/14/chartex" xmlns:mc="http://schemas.openxmlformats.org/markup-compatibility/2006" xmlns:aink="http://schemas.microsoft.com/office/drawing/2016/ink" xmlns:am3d="http://schemas.microsoft.com/office/drawing/2017/model3d" xmlns:o="urn:schemas-microsoft-com:office:office" xmlns:oel="http://schemas.microsoft.com/office/2019/extlst" xmlns:r="http://schemas.openxmlformats.org/officeDocument/2006/relationships" xmlns:m="http://schemas.openxmlformats.org/officeDocument/2006/math" xmlns:v="urn:schemas-microsoft-com:vml" xmlns:wp14="http://schemas.microsoft.com/office/word/2010/wordprocessingDrawing" xmlns:wp="http://schemas.openxmlformats.org/drawingml/2006/wordprocessingDrawing" xmlns:w10="urn:schemas-microsoft-com:office:word" xmlns:w="http://schemas.openxmlformats.org/wordprocessingml/2006/main" xmlns:w14="http://schemas.microsoft.com/office/word/2010/wordml" xmlns:w15="http://schemas.microsoft.com/office/word/2012/wordml" xmlns:w16cex="http://schemas.microsoft.com/office/word/2018/wordml/cex" xmlns:w16cid="http://schemas.microsoft.com/office/word/2016/wordml/cid" xmlns:w16="http://schemas.microsoft.com/office/word/2018/wordml" xmlns:w16du="http://schemas.microsoft.com/office/word/2023/wordml/word16du" xmlns:w16sdtdh="http://schemas.microsoft.com/office/word/2020/wordml/sdtdatahash" xmlns:w16sdtfl="http://schemas.microsoft.com/office/word/2024/wordml/sdtformatlock" xmlns:w16se="http://schemas.microsoft.com/office/word/2015/wordml/symex" xmlns:wpg="http://schemas.microsoft.com/office/word/2010/wordprocessingGroup" xmlns:wpi="http://schemas.microsoft.com/office/word/2010/wordprocessingInk" xmlns:wne="http://schemas.microsoft.com/office/word/2006/wordml" xmlns:wps="http://schemas.microsoft.com/office/word/2010/wordprocessingShape" mc:Ignorable="w14 w15 w16se w16cid w16 w16cex w16sdtdh w16sdtfl w16du wp14">
   <w:abstractNum w:abstractNumId="0" w15:restartNumberingAfterBreak="0">
+    <w:nsid w:val="11326D30"/>
+    <w:multiLevelType w:val="multilevel"/>
+    <w:tmpl w:val="5622EA96"/>
+    <w:lvl w:ilvl="0">
+      <w:start w:val="1"/>
+      <w:numFmt w:val="bullet"/>
+      <w:lvlText w:val=""/>
+      <w:lvlJc w:val="left"/>
+      <w:pPr>
+        <w:tabs>
+          <w:tab w:val="num" w:pos="720"/>
+        </w:tabs>
+        <w:ind w:left="720" w:hanging="360"/>
+      </w:pPr>
+      <w:rPr>
+        <w:rFonts w:ascii="Symbol" w:hAnsi="Symbol" w:hint="default"/>
+        <w:sz w:val="20"/>
+      </w:rPr>
+    </w:lvl>
+    <w:lvl w:ilvl="1" w:tentative="1">
+      <w:start w:val="1"/>
+      <w:numFmt w:val="bullet"/>
+      <w:lvlText w:val="o"/>
+      <w:lvlJc w:val="left"/>
+      <w:pPr>
+        <w:tabs>
+          <w:tab w:val="num" w:pos="1440"/>
+        </w:tabs>
+        <w:ind w:left="1440" w:hanging="360"/>
+      </w:pPr>
+      <w:rPr>
+        <w:rFonts w:ascii="Courier New" w:hAnsi="Courier New" w:hint="default"/>
+        <w:sz w:val="20"/>
+      </w:rPr>
+    </w:lvl>
+    <w:lvl w:ilvl="2" w:tentative="1">
+      <w:start w:val="1"/>
+      <w:numFmt w:val="bullet"/>
+      <w:lvlText w:val=""/>
+      <w:lvlJc w:val="left"/>
+      <w:pPr>
+        <w:tabs>
+          <w:tab w:val="num" w:pos="2160"/>
+        </w:tabs>
+        <w:ind w:left="2160" w:hanging="360"/>
+      </w:pPr>
+      <w:rPr>
+        <w:rFonts w:ascii="Wingdings" w:hAnsi="Wingdings" w:hint="default"/>
+        <w:sz w:val="20"/>
+      </w:rPr>
+    </w:lvl>
+    <w:lvl w:ilvl="3" w:tentative="1">
+      <w:start w:val="1"/>
+      <w:numFmt w:val="bullet"/>
+      <w:lvlText w:val=""/>
+      <w:lvlJc w:val="left"/>
+      <w:pPr>
+        <w:tabs>
+          <w:tab w:val="num" w:pos="2880"/>
+        </w:tabs>
+        <w:ind w:left="2880" w:hanging="360"/>
+      </w:pPr>
+      <w:rPr>
+        <w:rFonts w:ascii="Wingdings" w:hAnsi="Wingdings" w:hint="default"/>
+        <w:sz w:val="20"/>
+      </w:rPr>
+    </w:lvl>
+    <w:lvl w:ilvl="4" w:tentative="1">
+      <w:start w:val="1"/>
+      <w:numFmt w:val="bullet"/>
+      <w:lvlText w:val=""/>
+      <w:lvlJc w:val="left"/>
+      <w:pPr>
+        <w:tabs>
+          <w:tab w:val="num" w:pos="3600"/>
+        </w:tabs>
+        <w:ind w:left="3600" w:hanging="360"/>
+      </w:pPr>
+      <w:rPr>
+        <w:rFonts w:ascii="Wingdings" w:hAnsi="Wingdings" w:hint="default"/>
+        <w:sz w:val="20"/>
+      </w:rPr>
+    </w:lvl>
+    <w:lvl w:ilvl="5" w:tentative="1">
+      <w:start w:val="1"/>
+      <w:numFmt w:val="bullet"/>
+      <w:lvlText w:val=""/>
+      <w:lvlJc w:val="left"/>
+      <w:pPr>
+        <w:tabs>
+          <w:tab w:val="num" w:pos="4320"/>
+        </w:tabs>
+        <w:ind w:left="4320" w:hanging="360"/>
+      </w:pPr>
+      <w:rPr>
+        <w:rFonts w:ascii="Wingdings" w:hAnsi="Wingdings" w:hint="default"/>
+        <w:sz w:val="20"/>
+      </w:rPr>
+    </w:lvl>
+    <w:lvl w:ilvl="6" w:tentative="1">
+      <w:start w:val="1"/>
+      <w:numFmt w:val="bullet"/>
+      <w:lvlText w:val=""/>
+      <w:lvlJc w:val="left"/>
+      <w:pPr>
+        <w:tabs>
+          <w:tab w:val="num" w:pos="5040"/>
+        </w:tabs>
+        <w:ind w:left="5040" w:hanging="360"/>
+      </w:pPr>
+      <w:rPr>
+        <w:rFonts w:ascii="Wingdings" w:hAnsi="Wingdings" w:hint="default"/>
+        <w:sz w:val="20"/>
+      </w:rPr>
+    </w:lvl>
+    <w:lvl w:ilvl="7" w:tentative="1">
+      <w:start w:val="1"/>
+      <w:numFmt w:val="bullet"/>
+      <w:lvlText w:val=""/>
+      <w:lvlJc w:val="left"/>
+      <w:pPr>
+        <w:tabs>
+          <w:tab w:val="num" w:pos="5760"/>
+        </w:tabs>
+        <w:ind w:left="5760" w:hanging="360"/>
+      </w:pPr>
+      <w:rPr>
+        <w:rFonts w:ascii="Wingdings" w:hAnsi="Wingdings" w:hint="default"/>
+        <w:sz w:val="20"/>
+      </w:rPr>
+    </w:lvl>
+    <w:lvl w:ilvl="8" w:tentative="1">
+      <w:start w:val="1"/>
+      <w:numFmt w:val="bullet"/>
+      <w:lvlText w:val=""/>
+      <w:lvlJc w:val="left"/>
+      <w:pPr>
+        <w:tabs>
+          <w:tab w:val="num" w:pos="6480"/>
+        </w:tabs>
+        <w:ind w:left="6480" w:hanging="360"/>
+      </w:pPr>
+      <w:rPr>
+        <w:rFonts w:ascii="Wingdings" w:hAnsi="Wingdings" w:hint="default"/>
+        <w:sz w:val="20"/>
+      </w:rPr>
+    </w:lvl>
+  </w:abstractNum>
+  <w:abstractNum w:abstractNumId="1" w15:restartNumberingAfterBreak="0">
     <w:nsid w:val="1457138F"/>
     <w:multiLevelType w:val="multilevel"/>
     <w:tmpl w:val="140EA350"/>
@@ -1259,7 +1665,7 @@
       </w:rPr>
     </w:lvl>
   </w:abstractNum>
-  <w:abstractNum w:abstractNumId="1" w15:restartNumberingAfterBreak="0">
+  <w:abstractNum w:abstractNumId="2" w15:restartNumberingAfterBreak="0">
     <w:nsid w:val="33853459"/>
     <w:multiLevelType w:val="multilevel"/>
     <w:tmpl w:val="07D83C6C"/>
@@ -1408,7 +1814,7 @@
       </w:rPr>
     </w:lvl>
   </w:abstractNum>
-  <w:abstractNum w:abstractNumId="2" w15:restartNumberingAfterBreak="0">
+  <w:abstractNum w:abstractNumId="3" w15:restartNumberingAfterBreak="0">
     <w:nsid w:val="36C67D99"/>
     <w:multiLevelType w:val="multilevel"/>
     <w:tmpl w:val="52D048E6"/>
@@ -1557,7 +1963,7 @@
       </w:rPr>
     </w:lvl>
   </w:abstractNum>
-  <w:abstractNum w:abstractNumId="3" w15:restartNumberingAfterBreak="0">
+  <w:abstractNum w:abstractNumId="4" w15:restartNumberingAfterBreak="0">
     <w:nsid w:val="46A61E9F"/>
     <w:multiLevelType w:val="multilevel"/>
     <w:tmpl w:val="C93EE3F0"/>
@@ -1706,17 +2112,172 @@
       </w:rPr>
     </w:lvl>
   </w:abstractNum>
+  <w:abstractNum w:abstractNumId="5" w15:restartNumberingAfterBreak="0">
+    <w:nsid w:val="728062AB"/>
+    <w:multiLevelType w:val="multilevel"/>
+    <w:tmpl w:val="035E78C0"/>
+    <w:lvl w:ilvl="0">
+      <w:start w:val="1"/>
+      <w:numFmt w:val="bullet"/>
+      <w:lvlText w:val=""/>
+      <w:lvlJc w:val="left"/>
+      <w:pPr>
+        <w:tabs>
+          <w:tab w:val="num" w:pos="720"/>
+        </w:tabs>
+        <w:ind w:left="720" w:hanging="360"/>
+      </w:pPr>
+      <w:rPr>
+        <w:rFonts w:ascii="Symbol" w:hAnsi="Symbol" w:hint="default"/>
+        <w:sz w:val="20"/>
+      </w:rPr>
+    </w:lvl>
+    <w:lvl w:ilvl="1" w:tentative="1">
+      <w:start w:val="1"/>
+      <w:numFmt w:val="bullet"/>
+      <w:lvlText w:val="o"/>
+      <w:lvlJc w:val="left"/>
+      <w:pPr>
+        <w:tabs>
+          <w:tab w:val="num" w:pos="1440"/>
+        </w:tabs>
+        <w:ind w:left="1440" w:hanging="360"/>
+      </w:pPr>
+      <w:rPr>
+        <w:rFonts w:ascii="Courier New" w:hAnsi="Courier New" w:hint="default"/>
+        <w:sz w:val="20"/>
+      </w:rPr>
+    </w:lvl>
+    <w:lvl w:ilvl="2" w:tentative="1">
+      <w:start w:val="1"/>
+      <w:numFmt w:val="bullet"/>
+      <w:lvlText w:val=""/>
+      <w:lvlJc w:val="left"/>
+      <w:pPr>
+        <w:tabs>
+          <w:tab w:val="num" w:pos="2160"/>
+        </w:tabs>
+        <w:ind w:left="2160" w:hanging="360"/>
+      </w:pPr>
+      <w:rPr>
+        <w:rFonts w:ascii="Wingdings" w:hAnsi="Wingdings" w:hint="default"/>
+        <w:sz w:val="20"/>
+      </w:rPr>
+    </w:lvl>
+    <w:lvl w:ilvl="3" w:tentative="1">
+      <w:start w:val="1"/>
+      <w:numFmt w:val="bullet"/>
+      <w:lvlText w:val=""/>
+      <w:lvlJc w:val="left"/>
+      <w:pPr>
+        <w:tabs>
+          <w:tab w:val="num" w:pos="2880"/>
+        </w:tabs>
+        <w:ind w:left="2880" w:hanging="360"/>
+      </w:pPr>
+      <w:rPr>
+        <w:rFonts w:ascii="Wingdings" w:hAnsi="Wingdings" w:hint="default"/>
+        <w:sz w:val="20"/>
+      </w:rPr>
+    </w:lvl>
+    <w:lvl w:ilvl="4" w:tentative="1">
+      <w:start w:val="1"/>
+      <w:numFmt w:val="bullet"/>
+      <w:lvlText w:val=""/>
+      <w:lvlJc w:val="left"/>
+      <w:pPr>
+        <w:tabs>
+          <w:tab w:val="num" w:pos="3600"/>
+        </w:tabs>
+        <w:ind w:left="3600" w:hanging="360"/>
+      </w:pPr>
+      <w:rPr>
+        <w:rFonts w:ascii="Wingdings" w:hAnsi="Wingdings" w:hint="default"/>
+        <w:sz w:val="20"/>
+      </w:rPr>
+    </w:lvl>
+    <w:lvl w:ilvl="5" w:tentative="1">
+      <w:start w:val="1"/>
+      <w:numFmt w:val="bullet"/>
+      <w:lvlText w:val=""/>
+      <w:lvlJc w:val="left"/>
+      <w:pPr>
+        <w:tabs>
+          <w:tab w:val="num" w:pos="4320"/>
+        </w:tabs>
+        <w:ind w:left="4320" w:hanging="360"/>
+      </w:pPr>
+      <w:rPr>
+        <w:rFonts w:ascii="Wingdings" w:hAnsi="Wingdings" w:hint="default"/>
+        <w:sz w:val="20"/>
+      </w:rPr>
+    </w:lvl>
+    <w:lvl w:ilvl="6" w:tentative="1">
+      <w:start w:val="1"/>
+      <w:numFmt w:val="bullet"/>
+      <w:lvlText w:val=""/>
+      <w:lvlJc w:val="left"/>
+      <w:pPr>
+        <w:tabs>
+          <w:tab w:val="num" w:pos="5040"/>
+        </w:tabs>
+        <w:ind w:left="5040" w:hanging="360"/>
+      </w:pPr>
+      <w:rPr>
+        <w:rFonts w:ascii="Wingdings" w:hAnsi="Wingdings" w:hint="default"/>
+        <w:sz w:val="20"/>
+      </w:rPr>
+    </w:lvl>
+    <w:lvl w:ilvl="7" w:tentative="1">
+      <w:start w:val="1"/>
+      <w:numFmt w:val="bullet"/>
+      <w:lvlText w:val=""/>
+      <w:lvlJc w:val="left"/>
+      <w:pPr>
+        <w:tabs>
+          <w:tab w:val="num" w:pos="5760"/>
+        </w:tabs>
+        <w:ind w:left="5760" w:hanging="360"/>
+      </w:pPr>
+      <w:rPr>
+        <w:rFonts w:ascii="Wingdings" w:hAnsi="Wingdings" w:hint="default"/>
+        <w:sz w:val="20"/>
+      </w:rPr>
+    </w:lvl>
+    <w:lvl w:ilvl="8" w:tentative="1">
+      <w:start w:val="1"/>
+      <w:numFmt w:val="bullet"/>
+      <w:lvlText w:val=""/>
+      <w:lvlJc w:val="left"/>
+      <w:pPr>
+        <w:tabs>
+          <w:tab w:val="num" w:pos="6480"/>
+        </w:tabs>
+        <w:ind w:left="6480" w:hanging="360"/>
+      </w:pPr>
+      <w:rPr>
+        <w:rFonts w:ascii="Wingdings" w:hAnsi="Wingdings" w:hint="default"/>
+        <w:sz w:val="20"/>
+      </w:rPr>
+    </w:lvl>
+  </w:abstractNum>
   <w:num w:numId="1" w16cid:durableId="1109205808">
+    <w:abstractNumId w:val="2"/>
+  </w:num>
+  <w:num w:numId="2" w16cid:durableId="1819305090">
     <w:abstractNumId w:val="1"/>
   </w:num>
-  <w:num w:numId="2" w16cid:durableId="1819305090">
-    <w:abstractNumId w:val="0"/>
-  </w:num>
   <w:num w:numId="3" w16cid:durableId="1997952828">
-    <w:abstractNumId w:val="2"/>
+    <w:abstractNumId w:val="3"/>
   </w:num>
   <w:num w:numId="4" w16cid:durableId="2030136339">
-    <w:abstractNumId w:val="3"/>
+    <w:abstractNumId w:val="4"/>
+  </w:num>
+  <w:num w:numId="5" w16cid:durableId="1827473945">
+    <w:abstractNumId w:val="5"/>
+  </w:num>
+  <w:num w:numId="6" w16cid:durableId="439687217">
+    <w:abstractNumId w:val="0"/>
   </w:num>
 </w:numbering>
 </file>

</xml_diff>